<commit_message>
Popraw kolory i puste strony formularzy CIS
</commit_message>
<xml_diff>
--- a/public/wzory/CIS_A-02_Regulamin_rekrutacji_i_uczestnictwa.docx
+++ b/public/wzory/CIS_A-02_Regulamin_rekrutacji_i_uczestnictwa.docx
@@ -366,6 +366,7 @@
           <w:insideH w:val="single" w:sz="4" w:space="0" w:color="auto"/>
           <w:insideV w:val="single" w:sz="4" w:space="0" w:color="auto"/>
         </w:tblBorders>
+        <w:tblLayout w:type="fixed"/>
         <w:tblCellMar>
           <w:left w:w="10" w:type="dxa"/>
           <w:right w:w="10" w:type="dxa"/>
@@ -413,7 +414,7 @@
               <w:rPr>
                 <w:b/>
                 <w:bCs/>
-                <w:color w:val="000000"/>
+                <w:color w:val="FFFFFF"/>
                 <w:sz w:val="17"/>
                 <w:szCs w:val="17"/>
               </w:rPr>
@@ -447,7 +448,7 @@
               <w:rPr>
                 <w:b/>
                 <w:bCs/>
-                <w:color w:val="000000"/>
+                <w:color w:val="FFFFFF"/>
                 <w:sz w:val="17"/>
                 <w:szCs w:val="17"/>
               </w:rPr>
@@ -481,7 +482,7 @@
               <w:rPr>
                 <w:b/>
                 <w:bCs/>
-                <w:color w:val="000000"/>
+                <w:color w:val="FFFFFF"/>
                 <w:sz w:val="17"/>
                 <w:szCs w:val="17"/>
               </w:rPr>

</xml_diff>